<commit_message>
cambios en panel admin
</commit_message>
<xml_diff>
--- a/docs/TrabFlow_AI_Analisis_Completo.docx
+++ b/docs/TrabFlow_AI_Analisis_Completo.docx
@@ -6563,8 +6563,8 @@
       </w:tblPr>
       <w:tblGrid>
         <w:gridCol w:w="1400"/>
-        <w:gridCol w:w="1396"/>
-        <w:gridCol w:w="1604"/>
+        <w:gridCol w:w="1395"/>
+        <w:gridCol w:w="1605"/>
         <w:gridCol w:w="3200"/>
         <w:gridCol w:w="1760"/>
       </w:tblGrid>
@@ -6602,7 +6602,7 @@
         </w:tc>
         <w:tc>
           <w:tcPr>
-            <w:tcW w:w="1396" w:type="dxa"/>
+            <w:tcW w:w="1395" w:type="dxa"/>
             <w:tcBorders>
               <w:top w:val="single" w:sz="4" w:space="0" w:color="8AABCC"/>
               <w:left w:val="single" w:sz="4" w:space="0" w:color="8AABCC"/>
@@ -6632,7 +6632,7 @@
         </w:tc>
         <w:tc>
           <w:tcPr>
-            <w:tcW w:w="1604" w:type="dxa"/>
+            <w:tcW w:w="1605" w:type="dxa"/>
             <w:tcBorders>
               <w:top w:val="single" w:sz="4" w:space="0" w:color="8AABCC"/>
               <w:left w:val="single" w:sz="4" w:space="0" w:color="8AABCC"/>
@@ -6754,7 +6754,7 @@
         </w:tc>
         <w:tc>
           <w:tcPr>
-            <w:tcW w:w="1396" w:type="dxa"/>
+            <w:tcW w:w="1395" w:type="dxa"/>
             <w:tcBorders>
               <w:top w:val="single" w:sz="4" w:space="0" w:color="C0D0E0"/>
               <w:left w:val="single" w:sz="4" w:space="0" w:color="C0D0E0"/>
@@ -6782,7 +6782,7 @@
         </w:tc>
         <w:tc>
           <w:tcPr>
-            <w:tcW w:w="1604" w:type="dxa"/>
+            <w:tcW w:w="1605" w:type="dxa"/>
             <w:tcBorders>
               <w:top w:val="single" w:sz="4" w:space="0" w:color="C0D0E0"/>
               <w:left w:val="single" w:sz="4" w:space="0" w:color="C0D0E0"/>
@@ -6899,7 +6899,7 @@
         </w:tc>
         <w:tc>
           <w:tcPr>
-            <w:tcW w:w="1396" w:type="dxa"/>
+            <w:tcW w:w="1395" w:type="dxa"/>
             <w:tcBorders>
               <w:top w:val="single" w:sz="4" w:space="0" w:color="C0D0E0"/>
               <w:left w:val="single" w:sz="4" w:space="0" w:color="C0D0E0"/>
@@ -6927,7 +6927,7 @@
         </w:tc>
         <w:tc>
           <w:tcPr>
-            <w:tcW w:w="1604" w:type="dxa"/>
+            <w:tcW w:w="1605" w:type="dxa"/>
             <w:tcBorders>
               <w:top w:val="single" w:sz="4" w:space="0" w:color="C0D0E0"/>
               <w:left w:val="single" w:sz="4" w:space="0" w:color="C0D0E0"/>
@@ -7044,7 +7044,7 @@
         </w:tc>
         <w:tc>
           <w:tcPr>
-            <w:tcW w:w="1396" w:type="dxa"/>
+            <w:tcW w:w="1395" w:type="dxa"/>
             <w:tcBorders>
               <w:top w:val="single" w:sz="4" w:space="0" w:color="C0D0E0"/>
               <w:left w:val="single" w:sz="4" w:space="0" w:color="C0D0E0"/>
@@ -7072,7 +7072,7 @@
         </w:tc>
         <w:tc>
           <w:tcPr>
-            <w:tcW w:w="1604" w:type="dxa"/>
+            <w:tcW w:w="1605" w:type="dxa"/>
             <w:tcBorders>
               <w:top w:val="single" w:sz="4" w:space="0" w:color="C0D0E0"/>
               <w:left w:val="single" w:sz="4" w:space="0" w:color="C0D0E0"/>
@@ -7189,7 +7189,7 @@
         </w:tc>
         <w:tc>
           <w:tcPr>
-            <w:tcW w:w="1396" w:type="dxa"/>
+            <w:tcW w:w="1395" w:type="dxa"/>
             <w:tcBorders>
               <w:top w:val="single" w:sz="4" w:space="0" w:color="C0D0E0"/>
               <w:left w:val="single" w:sz="4" w:space="0" w:color="C0D0E0"/>
@@ -7217,7 +7217,7 @@
         </w:tc>
         <w:tc>
           <w:tcPr>
-            <w:tcW w:w="1604" w:type="dxa"/>
+            <w:tcW w:w="1605" w:type="dxa"/>
             <w:tcBorders>
               <w:top w:val="single" w:sz="4" w:space="0" w:color="C0D0E0"/>
               <w:left w:val="single" w:sz="4" w:space="0" w:color="C0D0E0"/>
@@ -7334,7 +7334,7 @@
         </w:tc>
         <w:tc>
           <w:tcPr>
-            <w:tcW w:w="1396" w:type="dxa"/>
+            <w:tcW w:w="1395" w:type="dxa"/>
             <w:tcBorders>
               <w:top w:val="single" w:sz="4" w:space="0" w:color="C0D0E0"/>
               <w:left w:val="single" w:sz="4" w:space="0" w:color="C0D0E0"/>
@@ -7362,7 +7362,7 @@
         </w:tc>
         <w:tc>
           <w:tcPr>
-            <w:tcW w:w="1604" w:type="dxa"/>
+            <w:tcW w:w="1605" w:type="dxa"/>
             <w:tcBorders>
               <w:top w:val="single" w:sz="4" w:space="0" w:color="C0D0E0"/>
               <w:left w:val="single" w:sz="4" w:space="0" w:color="C0D0E0"/>
@@ -7479,7 +7479,7 @@
         </w:tc>
         <w:tc>
           <w:tcPr>
-            <w:tcW w:w="1396" w:type="dxa"/>
+            <w:tcW w:w="1395" w:type="dxa"/>
             <w:tcBorders>
               <w:top w:val="single" w:sz="4" w:space="0" w:color="C0D0E0"/>
               <w:left w:val="single" w:sz="4" w:space="0" w:color="C0D0E0"/>
@@ -7507,7 +7507,7 @@
         </w:tc>
         <w:tc>
           <w:tcPr>
-            <w:tcW w:w="1604" w:type="dxa"/>
+            <w:tcW w:w="1605" w:type="dxa"/>
             <w:tcBorders>
               <w:top w:val="single" w:sz="4" w:space="0" w:color="C0D0E0"/>
               <w:left w:val="single" w:sz="4" w:space="0" w:color="C0D0E0"/>
@@ -7624,7 +7624,7 @@
         </w:tc>
         <w:tc>
           <w:tcPr>
-            <w:tcW w:w="1396" w:type="dxa"/>
+            <w:tcW w:w="1395" w:type="dxa"/>
             <w:tcBorders>
               <w:top w:val="single" w:sz="4" w:space="0" w:color="C0D0E0"/>
               <w:left w:val="single" w:sz="4" w:space="0" w:color="C0D0E0"/>
@@ -7652,7 +7652,7 @@
         </w:tc>
         <w:tc>
           <w:tcPr>
-            <w:tcW w:w="1604" w:type="dxa"/>
+            <w:tcW w:w="1605" w:type="dxa"/>
             <w:tcBorders>
               <w:top w:val="single" w:sz="4" w:space="0" w:color="C0D0E0"/>
               <w:left w:val="single" w:sz="4" w:space="0" w:color="C0D0E0"/>
@@ -7769,7 +7769,7 @@
         </w:tc>
         <w:tc>
           <w:tcPr>
-            <w:tcW w:w="1396" w:type="dxa"/>
+            <w:tcW w:w="1395" w:type="dxa"/>
             <w:tcBorders>
               <w:top w:val="single" w:sz="4" w:space="0" w:color="C0D0E0"/>
               <w:left w:val="single" w:sz="4" w:space="0" w:color="C0D0E0"/>
@@ -7797,7 +7797,7 @@
         </w:tc>
         <w:tc>
           <w:tcPr>
-            <w:tcW w:w="1604" w:type="dxa"/>
+            <w:tcW w:w="1605" w:type="dxa"/>
             <w:tcBorders>
               <w:top w:val="single" w:sz="4" w:space="0" w:color="C0D0E0"/>
               <w:left w:val="single" w:sz="4" w:space="0" w:color="C0D0E0"/>
@@ -22838,29 +22838,7 @@
                 <w:sz w:val="22"/>
                 <w:szCs w:val="22"/>
               </w:rPr>
-              <w:t>REGLA DE ORO DE TRA</w:t>
-            </w:r>
-            <w:r>
-              <w:rPr>
-                <w:rFonts w:eastAsia="Arial" w:cs="Arial"/>
-                <w:b/>
-                <w:bCs/>
-                <w:color w:val="FFFFFF"/>
-                <w:sz w:val="22"/>
-                <w:szCs w:val="22"/>
-              </w:rPr>
-              <w:t>B</w:t>
-            </w:r>
-            <w:r>
-              <w:rPr>
-                <w:rFonts w:eastAsia="Arial" w:cs="Arial"/>
-                <w:b/>
-                <w:bCs/>
-                <w:color w:val="FFFFFF"/>
-                <w:sz w:val="22"/>
-                <w:szCs w:val="22"/>
-              </w:rPr>
-              <w:t>FLOW AI</w:t>
+              <w:t>REGLA DE ORO DE TRABFLOW AI</w:t>
             </w:r>
           </w:p>
           <w:p>
@@ -22947,11 +22925,7 @@
       </w:r>
       <w:r>
         <w:rPr/>
-        <w:t>sk-proj-</w:t>
-      </w:r>
-      <w:r>
-        <w:rPr/>
-        <w:t>***** INSTALADA EN SUPABASE**</w:t>
+        <w:t>sk-proj-***** INSTALADA EN SUPABASE**</w:t>
       </w:r>
     </w:p>
     <w:p>
@@ -23282,7 +23256,7 @@
     </w:r>
     <w:r>
       <w:rPr/>
-      <w:t>30</w:t>
+      <w:t>31</w:t>
     </w:r>
     <w:r>
       <w:rPr/>

</xml_diff>